<commit_message>
docs: add Section 7 — WMS login handling rules to KB
Captures learnings from multi-market session debugging:
- Rule 1: pre-run session check for every market before scan starts
- Rule 2: detect login completion via .ssc-select DOM element, not URL
- Rule 3: never block on input(); auto-continue when WMS app loads
- Rule 4: mid-run session expiry fallback inside navigation helper
- Rule 5: admin portal session is separate from WMS market sessions

Co-Authored-By: Claude Sonnet 4.6 <noreply@anthropic.com>
</commit_message>
<xml_diff>
--- a/Knowledge Base - WMS adoption tracking.docx
+++ b/Knowledge Base - WMS adoption tracking.docx
@@ -3137,6 +3137,269 @@
           <w:rtl w:val="0"/>
         </w:rPr>
         <w:t xml:space="preserve">You may only: navigate to URLs, scroll, and read visible page content.</w:t>
+      </w:r>
+    </w:p>
+    <w:p>
+      <w:pPr>
+        <w:spacing w:after="80" w:lineRule="auto"/>
+        <w:rPr/>
+      </w:pPr>
+      <w:r>
+        <w:rPr>
+          <w:b w:val="1"/>
+          <w:bCs w:val="1"/>
+          <w:sz w:val="34"/>
+          <w:szCs w:val="34"/>
+          <w:rtl w:val="0"/>
+        </w:rPr>
+        <w:t xml:space="preserve">7. WMS login handling</w:t>
+      </w:r>
+    </w:p>
+    <w:p>
+      <w:pPr>
+        <w:spacing w:after="240" w:before="0" w:lineRule="auto"/>
+        <w:rPr/>
+      </w:pPr>
+      <w:r>
+        <w:rPr>
+          <w:rtl w:val="0"/>
+        </w:rPr>
+        <w:t xml:space="preserve">WMS uses per-market sessions. Logging into one market (e.g. PH) does </w:t>
+      </w:r>
+      <w:r>
+        <w:rPr>
+          <w:b w:val="1"/>
+          <w:bCs w:val="1"/>
+          <w:rtl w:val="0"/>
+        </w:rPr>
+        <w:t xml:space="preserve">not</w:t>
+      </w:r>
+      <w:r>
+        <w:rPr>
+          <w:rtl w:val="0"/>
+        </w:rPr>
+        <w:t xml:space="preserve"> grant access to another market (e.g. SG or MY). Each domain maintains its own independent session cookie. The following rules must be applied by the runner at all times.</w:t>
+      </w:r>
+    </w:p>
+    <w:p>
+      <w:pPr>
+        <w:spacing w:after="80" w:before="160" w:lineRule="auto"/>
+        <w:rPr/>
+      </w:pPr>
+      <w:r>
+        <w:rPr>
+          <w:b w:val="1"/>
+          <w:bCs w:val="1"/>
+          <w:rtl w:val="0"/>
+        </w:rPr>
+        <w:t xml:space="preserve">Rule 1 — Pre-run session check (mandatory)</w:t>
+      </w:r>
+    </w:p>
+    <w:p>
+      <w:pPr>
+        <w:spacing w:after="240" w:before="0" w:lineRule="auto"/>
+        <w:rPr/>
+      </w:pPr>
+      <w:r>
+        <w:rPr>
+          <w:rtl w:val="0"/>
+        </w:rPr>
+        <w:t xml:space="preserve">Before any feature scan begins, the runner must navigate to each required market’s WMS base URL and verify that the session is active. This must happen at startup for every market that appears in any checker’s MARKETS list, not only the first market in the run order.</w:t>
+      </w:r>
+    </w:p>
+    <w:p>
+      <w:pPr>
+        <w:spacing w:after="80" w:before="160" w:lineRule="auto"/>
+        <w:rPr/>
+      </w:pPr>
+      <w:r>
+        <w:rPr>
+          <w:b w:val="1"/>
+          <w:bCs w:val="1"/>
+          <w:rtl w:val="0"/>
+        </w:rPr>
+        <w:t xml:space="preserve">Rule 2 — Detect login by UI element, not URL</w:t>
+      </w:r>
+    </w:p>
+    <w:p>
+      <w:pPr>
+        <w:spacing w:after="240" w:before="0" w:lineRule="auto"/>
+        <w:rPr/>
+      </w:pPr>
+      <w:r>
+        <w:rPr>
+          <w:rtl w:val="0"/>
+        </w:rPr>
+        <w:t xml:space="preserve">Do not rely on the page URL to decide whether login is complete. The post-OAuth redirect can land on a URL that passes a “login” keyword check while the WMS app has not yet rendered. Instead, poll for the CSS selector </w:t>
+      </w:r>
+      <w:r>
+        <w:rPr>
+          <w:rFonts w:ascii="Courier New" w:hAnsi="Courier New"/>
+          <w:rtl w:val="0"/>
+        </w:rPr>
+        <w:t xml:space="preserve">.ssc-select</w:t>
+      </w:r>
+      <w:r>
+        <w:rPr>
+          <w:rtl w:val="0"/>
+        </w:rPr>
+        <w:t xml:space="preserve"> (the WMS warehouse dropdown), which only appears once the user is authenticated and the application shell has loaded. Login is considered complete when this element is present in the DOM.</w:t>
+      </w:r>
+    </w:p>
+    <w:p>
+      <w:pPr>
+        <w:spacing w:after="80" w:before="160" w:lineRule="auto"/>
+        <w:rPr/>
+      </w:pPr>
+      <w:r>
+        <w:rPr>
+          <w:b w:val="1"/>
+          <w:bCs w:val="1"/>
+          <w:rtl w:val="0"/>
+        </w:rPr>
+        <w:t xml:space="preserve">Rule 3 — Never block on manual input() for login</w:t>
+      </w:r>
+    </w:p>
+    <w:p>
+      <w:pPr>
+        <w:spacing w:after="240" w:before="0" w:lineRule="auto"/>
+        <w:rPr/>
+      </w:pPr>
+      <w:r>
+        <w:rPr>
+          <w:rtl w:val="0"/>
+        </w:rPr>
+        <w:t xml:space="preserve">The runner must not pause with </w:t>
+      </w:r>
+      <w:r>
+        <w:rPr>
+          <w:rFonts w:ascii="Courier New" w:hAnsi="Courier New"/>
+          <w:rtl w:val="0"/>
+        </w:rPr>
+        <w:t xml:space="preserve">input()</w:t>
+      </w:r>
+      <w:r>
+        <w:rPr>
+          <w:rtl w:val="0"/>
+        </w:rPr>
+        <w:t xml:space="preserve"> waiting for a keypress. Instead it must poll for the </w:t>
+      </w:r>
+      <w:r>
+        <w:rPr>
+          <w:rFonts w:ascii="Courier New" w:hAnsi="Courier New"/>
+          <w:rtl w:val="0"/>
+        </w:rPr>
+        <w:t xml:space="preserve">.ssc-select</w:t>
+      </w:r>
+      <w:r>
+        <w:rPr>
+          <w:rtl w:val="0"/>
+        </w:rPr>
+        <w:t xml:space="preserve"> element and auto-continue as soon as it appears. This allows the Google SSO flow to complete in the browser without any terminal interaction from the user.</w:t>
+      </w:r>
+    </w:p>
+    <w:p>
+      <w:pPr>
+        <w:spacing w:after="80" w:before="160" w:lineRule="auto"/>
+        <w:rPr/>
+      </w:pPr>
+      <w:r>
+        <w:rPr>
+          <w:b w:val="1"/>
+          <w:bCs w:val="1"/>
+          <w:rtl w:val="0"/>
+        </w:rPr>
+        <w:t xml:space="preserve">Rule 4 — Mid-run session expiry</w:t>
+      </w:r>
+    </w:p>
+    <w:p>
+      <w:pPr>
+        <w:spacing w:after="240" w:before="0" w:lineRule="auto"/>
+        <w:rPr/>
+      </w:pPr>
+      <w:r>
+        <w:rPr>
+          <w:rtl w:val="0"/>
+        </w:rPr>
+        <w:t xml:space="preserve">If a </w:t>
+      </w:r>
+      <w:r>
+        <w:rPr>
+          <w:rFonts w:ascii="Courier New" w:hAnsi="Courier New"/>
+          <w:rtl w:val="0"/>
+        </w:rPr>
+        <w:t xml:space="preserve">page.goto()</w:t>
+      </w:r>
+      <w:r>
+        <w:rPr>
+          <w:rtl w:val="0"/>
+        </w:rPr>
+        <w:t xml:space="preserve"> during the warehouse scan redirects to a login page, the runner must apply the same polling detection (Rule 2) before retrying the navigation. The per-market pre-flight check (Rule 1) reduces the likelihood of mid-run expiry, but the fallback must still be present inside the navigation helper.</w:t>
+      </w:r>
+    </w:p>
+    <w:p>
+      <w:pPr>
+        <w:spacing w:after="80" w:before="160" w:lineRule="auto"/>
+        <w:rPr/>
+      </w:pPr>
+      <w:r>
+        <w:rPr>
+          <w:b w:val="1"/>
+          <w:bCs w:val="1"/>
+          <w:rtl w:val="0"/>
+        </w:rPr>
+        <w:t xml:space="preserve">Rule 5 — Admin portal session is separate</w:t>
+      </w:r>
+    </w:p>
+    <w:p>
+      <w:pPr>
+        <w:spacing w:after="240" w:before="0" w:lineRule="auto"/>
+        <w:rPr/>
+      </w:pPr>
+      <w:r>
+        <w:rPr>
+          <w:rtl w:val="0"/>
+        </w:rPr>
+        <w:t xml:space="preserve">The admin portal at </w:t>
+      </w:r>
+      <w:r>
+        <w:rPr>
+          <w:rFonts w:ascii="Courier New" w:hAnsi="Courier New"/>
+          <w:rtl w:val="0"/>
+        </w:rPr>
+        <w:t xml:space="preserve">ops.ssc.shopeemobile.com</w:t>
+      </w:r>
+      <w:r>
+        <w:rPr>
+          <w:rtl w:val="0"/>
+        </w:rPr>
+        <w:t xml:space="preserve"> maintains its own session independent of any WMS market. If any checker has </w:t>
+      </w:r>
+      <w:r>
+        <w:rPr>
+          <w:rFonts w:ascii="Courier New" w:hAnsi="Courier New"/>
+          <w:rtl w:val="0"/>
+        </w:rPr>
+        <w:t xml:space="preserve">CHECK_TYPE = “admin_portal”</w:t>
+      </w:r>
+      <w:r>
+        <w:rPr>
+          <w:rtl w:val="0"/>
+        </w:rPr>
+        <w:t xml:space="preserve">, the pre-run check must also navigate to the admin portal base URL and confirm access before the scan starts. Login detection for the admin portal uses URL inspection (wait for the URL to leave the login domain) since the admin portal does not use the </w:t>
+      </w:r>
+      <w:r>
+        <w:rPr>
+          <w:rFonts w:ascii="Courier New" w:hAnsi="Courier New"/>
+          <w:rtl w:val="0"/>
+        </w:rPr>
+        <w:t xml:space="preserve">.ssc-select</w:t>
+      </w:r>
+      <w:r>
+        <w:rPr>
+          <w:rtl w:val="0"/>
+        </w:rPr>
+        <w:t xml:space="preserve"> element.</w:t>
       </w:r>
     </w:p>
     <w:p>

</xml_diff>